<commit_message>
CA: update the NDA to the 23 September revision
Same filename and URL, so both Download CA (DOCX) buttons pick it
up without markup changes.

Co-Authored-By: Claude Opus 5 <noreply@anthropic.com>
</commit_message>
<xml_diff>
--- a/assets/SRE-NDA-Hyatt-House-Lincoln-Park.docx
+++ b/assets/SRE-NDA-Hyatt-House-Lincoln-Park.docx
@@ -91,7 +91,7 @@
           <w:sz w:val="22"/>
           <w:szCs w:val="22"/>
         </w:rPr>
-        <w:t>September 11, 2026</w:t>
+        <w:t>September 23, 2026</w:t>
       </w:r>
       <w:r>
         <w:rPr>
@@ -2019,190 +2019,6 @@
       </w:r>
       <w:r>
         <w:tab/>
-      </w:r>
-    </w:p>
-    <w:p>
-      <w:pPr>
-        <w:spacing w:before="120" w:line="240" w:lineRule="atLeast"/>
-        <w:ind w:right="-41"/>
-        <w:jc w:val="both"/>
-        <w:rPr>
-          <w:sz w:val="22"/>
-        </w:rPr>
-      </w:pPr>
-    </w:p>
-    <w:p>
-      <w:pPr>
-        <w:spacing w:before="120" w:line="240" w:lineRule="atLeast"/>
-        <w:ind w:right="-41"/>
-        <w:jc w:val="both"/>
-        <w:rPr>
-          <w:sz w:val="22"/>
-        </w:rPr>
-      </w:pPr>
-    </w:p>
-    <w:p>
-      <w:pPr>
-        <w:spacing w:before="120" w:line="240" w:lineRule="atLeast"/>
-        <w:ind w:right="-41"/>
-        <w:jc w:val="both"/>
-        <w:rPr>
-          <w:sz w:val="22"/>
-        </w:rPr>
-      </w:pPr>
-      <w:r>
-        <w:rPr>
-          <w:sz w:val="22"/>
-        </w:rPr>
-        <w:t xml:space="preserve">Confirmed and </w:t>
-      </w:r>
-      <w:proofErr w:type="gramStart"/>
-      <w:r>
-        <w:rPr>
-          <w:sz w:val="22"/>
-        </w:rPr>
-        <w:t>Agreed</w:t>
-      </w:r>
-      <w:proofErr w:type="gramEnd"/>
-      <w:r>
-        <w:rPr>
-          <w:sz w:val="22"/>
-        </w:rPr>
-        <w:t xml:space="preserve"> as </w:t>
-      </w:r>
-    </w:p>
-    <w:p>
-      <w:pPr>
-        <w:spacing w:before="120" w:line="160" w:lineRule="exact"/>
-        <w:ind w:right="-43"/>
-        <w:jc w:val="both"/>
-        <w:rPr>
-          <w:sz w:val="22"/>
-        </w:rPr>
-      </w:pPr>
-      <w:r>
-        <w:rPr>
-          <w:sz w:val="22"/>
-        </w:rPr>
-        <w:t>of the date written above:</w:t>
-      </w:r>
-    </w:p>
-    <w:p>
-      <w:pPr>
-        <w:spacing w:before="120" w:line="160" w:lineRule="exact"/>
-        <w:ind w:right="-43"/>
-        <w:jc w:val="both"/>
-        <w:rPr>
-          <w:sz w:val="22"/>
-        </w:rPr>
-      </w:pPr>
-    </w:p>
-    <w:p>
-      <w:pPr>
-        <w:rPr>
-          <w:sz w:val="22"/>
-          <w:szCs w:val="22"/>
-        </w:rPr>
-      </w:pPr>
-      <w:r>
-        <w:rPr>
-          <w:sz w:val="22"/>
-          <w:szCs w:val="22"/>
-        </w:rPr>
-        <w:t>SRE</w:t>
-      </w:r>
-      <w:r>
-        <w:rPr>
-          <w:sz w:val="22"/>
-          <w:szCs w:val="22"/>
-        </w:rPr>
-        <w:t xml:space="preserve"> 4610 Propco JV, LLC</w:t>
-      </w:r>
-    </w:p>
-    <w:p>
-      <w:pPr>
-        <w:pStyle w:val="NoSpacing"/>
-      </w:pPr>
-    </w:p>
-    <w:p>
-      <w:pPr>
-        <w:pStyle w:val="NoSpacing"/>
-      </w:pPr>
-    </w:p>
-    <w:p>
-      <w:pPr>
-        <w:pStyle w:val="SignatureLine2-col"/>
-        <w:tabs>
-          <w:tab w:val="left" w:pos="3600"/>
-        </w:tabs>
-        <w:spacing w:before="0"/>
-        <w:jc w:val="both"/>
-        <w:rPr>
-          <w:color w:val="000000"/>
-          <w:sz w:val="22"/>
-        </w:rPr>
-      </w:pPr>
-      <w:r>
-        <w:rPr>
-          <w:color w:val="000000"/>
-          <w:sz w:val="22"/>
-        </w:rPr>
-        <w:t xml:space="preserve">By: </w:t>
-      </w:r>
-      <w:r>
-        <w:rPr>
-          <w:color w:val="000000"/>
-          <w:sz w:val="22"/>
-        </w:rPr>
-        <w:tab/>
-      </w:r>
-      <w:r>
-        <w:rPr>
-          <w:color w:val="000000"/>
-          <w:sz w:val="22"/>
-          <w:u w:val="single"/>
-        </w:rPr>
-        <w:tab/>
-      </w:r>
-      <w:r>
-        <w:rPr>
-          <w:color w:val="000000"/>
-          <w:sz w:val="22"/>
-        </w:rPr>
-        <w:tab/>
-      </w:r>
-      <w:r>
-        <w:rPr>
-          <w:color w:val="000000"/>
-          <w:sz w:val="22"/>
-        </w:rPr>
-        <w:br/>
-        <w:t>Name:</w:t>
-      </w:r>
-      <w:r>
-        <w:rPr>
-          <w:color w:val="000000"/>
-          <w:sz w:val="22"/>
-        </w:rPr>
-        <w:t xml:space="preserve"> </w:t>
-      </w:r>
-    </w:p>
-    <w:p>
-      <w:pPr>
-        <w:pStyle w:val="FlushRight"/>
-        <w:spacing w:before="0"/>
-        <w:jc w:val="both"/>
-        <w:rPr>
-          <w:color w:val="000000"/>
-          <w:sz w:val="22"/>
-        </w:rPr>
-      </w:pPr>
-      <w:r>
-        <w:rPr>
-          <w:color w:val="000000"/>
-          <w:sz w:val="22"/>
-        </w:rPr>
-        <w:t>Title:</w:t>
       </w:r>
     </w:p>
     <w:p>

</xml_diff>